<commit_message>
worked on some files but left the work for later
</commit_message>
<xml_diff>
--- a/lab 5.docx
+++ b/lab 5.docx
@@ -1,6 +1,6 @@
 
 <file path=word/document.xml><?xml version="1.0" encoding="utf-8"?>
-<w:document xmlns:wpc="http://schemas.microsoft.com/office/word/2010/wordprocessingCanvas" xmlns:cx="http://schemas.microsoft.com/office/drawing/2014/chartex" xmlns:cx1="http://schemas.microsoft.com/office/drawing/2015/9/8/chartex" xmlns:cx2="http://schemas.microsoft.com/office/drawing/2015/10/21/chartex" xmlns:cx3="http://schemas.microsoft.com/office/drawing/2016/5/9/chartex" xmlns:cx4="http://schemas.microsoft.com/office/drawing/2016/5/10/chartex" xmlns:cx5="http://schemas.microsoft.com/office/drawing/2016/5/11/chartex" xmlns:cx6="http://schemas.microsoft.com/office/drawing/2016/5/12/chartex" xmlns:cx7="http://schemas.microsoft.com/office/drawing/2016/5/13/chartex" xmlns:cx8="http://schemas.microsoft.com/office/drawing/2016/5/14/chartex" xmlns:mc="http://schemas.openxmlformats.org/markup-compatibility/2006" xmlns:aink="http://schemas.microsoft.com/office/drawing/2016/ink" xmlns:am3d="http://schemas.microsoft.com/office/drawing/2017/model3d" xmlns:o="urn:schemas-microsoft-com:office:office" xmlns:r="http://schemas.openxmlformats.org/officeDocument/2006/relationships" xmlns:m="http://schemas.openxmlformats.org/officeDocument/2006/math" xmlns:v="urn:schemas-microsoft-com:vml" xmlns:wp14="http://schemas.microsoft.com/office/word/2010/wordprocessingDrawing" xmlns:wp="http://schemas.openxmlformats.org/drawingml/2006/wordprocessingDrawing" xmlns:w10="urn:schemas-microsoft-com:office:word" xmlns:w="http://schemas.openxmlformats.org/wordprocessingml/2006/main" xmlns:w14="http://schemas.microsoft.com/office/word/2010/wordml" xmlns:w15="http://schemas.microsoft.com/office/word/2012/wordml" xmlns:w16cex="http://schemas.microsoft.com/office/word/2018/wordml/cex" xmlns:w16cid="http://schemas.microsoft.com/office/word/2016/wordml/cid" xmlns:w16="http://schemas.microsoft.com/office/word/2018/wordml" xmlns:w16sdtdh="http://schemas.microsoft.com/office/word/2020/wordml/sdtdatahash" xmlns:w16se="http://schemas.microsoft.com/office/word/2015/wordml/symex" xmlns:wpg="http://schemas.microsoft.com/office/word/2010/wordprocessingGroup" xmlns:wpi="http://schemas.microsoft.com/office/word/2010/wordprocessingInk" xmlns:wne="http://schemas.microsoft.com/office/word/2006/wordml" xmlns:wps="http://schemas.microsoft.com/office/word/2010/wordprocessingShape" mc:Ignorable="w14 w15 w16se w16cid w16 w16cex w16sdtdh wp14">
+<w:document xmlns:wpc="http://schemas.microsoft.com/office/word/2010/wordprocessingCanvas" xmlns:cx="http://schemas.microsoft.com/office/drawing/2014/chartex" xmlns:cx1="http://schemas.microsoft.com/office/drawing/2015/9/8/chartex" xmlns:cx2="http://schemas.microsoft.com/office/drawing/2015/10/21/chartex" xmlns:cx3="http://schemas.microsoft.com/office/drawing/2016/5/9/chartex" xmlns:cx4="http://schemas.microsoft.com/office/drawing/2016/5/10/chartex" xmlns:cx5="http://schemas.microsoft.com/office/drawing/2016/5/11/chartex" xmlns:cx6="http://schemas.microsoft.com/office/drawing/2016/5/12/chartex" xmlns:cx7="http://schemas.microsoft.com/office/drawing/2016/5/13/chartex" xmlns:cx8="http://schemas.microsoft.com/office/drawing/2016/5/14/chartex" xmlns:mc="http://schemas.openxmlformats.org/markup-compatibility/2006" xmlns:aink="http://schemas.microsoft.com/office/drawing/2016/ink" xmlns:am3d="http://schemas.microsoft.com/office/drawing/2017/model3d" xmlns:o="urn:schemas-microsoft-com:office:office" xmlns:oel="http://schemas.microsoft.com/office/2019/extlst" xmlns:r="http://schemas.openxmlformats.org/officeDocument/2006/relationships" xmlns:m="http://schemas.openxmlformats.org/officeDocument/2006/math" xmlns:v="urn:schemas-microsoft-com:vml" xmlns:wp14="http://schemas.microsoft.com/office/word/2010/wordprocessingDrawing" xmlns:wp="http://schemas.openxmlformats.org/drawingml/2006/wordprocessingDrawing" xmlns:w10="urn:schemas-microsoft-com:office:word" xmlns:w="http://schemas.openxmlformats.org/wordprocessingml/2006/main" xmlns:w14="http://schemas.microsoft.com/office/word/2010/wordml" xmlns:w15="http://schemas.microsoft.com/office/word/2012/wordml" xmlns:w16cex="http://schemas.microsoft.com/office/word/2018/wordml/cex" xmlns:w16cid="http://schemas.microsoft.com/office/word/2016/wordml/cid" xmlns:w16="http://schemas.microsoft.com/office/word/2018/wordml" xmlns:w16sdtdh="http://schemas.microsoft.com/office/word/2020/wordml/sdtdatahash" xmlns:w16se="http://schemas.microsoft.com/office/word/2015/wordml/symex" xmlns:wpg="http://schemas.microsoft.com/office/word/2010/wordprocessingGroup" xmlns:wpi="http://schemas.microsoft.com/office/word/2010/wordprocessingInk" xmlns:wne="http://schemas.microsoft.com/office/word/2006/wordml" xmlns:wps="http://schemas.microsoft.com/office/word/2010/wordprocessingShape" mc:Ignorable="w14 w15 w16se w16cid w16 w16cex w16sdtdh wp14">
   <w:body>
     <w:p>
       <w:pPr>
@@ -148,15 +148,7 @@
           <w:sz w:val="32"/>
           <w:szCs w:val="32"/>
         </w:rPr>
-        <w:t>D</w:t>
-      </w:r>
-      <w:r>
-        <w:rPr>
-          <w:b/>
-          <w:sz w:val="32"/>
-          <w:szCs w:val="32"/>
-        </w:rPr>
-        <w:t xml:space="preserve">ate: </w:t>
+        <w:t xml:space="preserve">Date: </w:t>
       </w:r>
       <w:r>
         <w:rPr>
@@ -321,7 +313,13 @@
         <w:rPr>
           <w:b/>
         </w:rPr>
-        <w:t>raffay</w:t>
+        <w:t>R</w:t>
+      </w:r>
+      <w:r>
+        <w:rPr>
+          <w:b/>
+        </w:rPr>
+        <w:t>affay</w:t>
       </w:r>
       <w:proofErr w:type="spellEnd"/>
       <w:r>
@@ -386,7 +384,7 @@
       </w:pPr>
       <w:r>
         <w:pict w14:anchorId="50FAD304">
-          <v:rect id="_x0000_i1025" style="width:0;height:1.5pt" o:hralign="center" o:hrstd="t" o:hr="t" fillcolor="#a0a0a0" stroked="f"/>
+          <v:rect id="_x0000_i1026" style="width:0;height:1.5pt" o:hralign="center" o:hrstd="t" o:hr="t" fillcolor="#a0a0a0" stroked="f"/>
         </w:pict>
       </w:r>
     </w:p>
@@ -453,11 +451,10 @@
     <w:p>
       <w:pPr>
         <w:spacing w:before="240" w:after="240"/>
-        <w:ind w:left="720" w:hanging="360"/>
       </w:pPr>
       <w:r>
         <w:pict w14:anchorId="417E29F4">
-          <v:rect id="_x0000_i1038" style="width:0;height:1.5pt" o:hralign="center" o:hrstd="t" o:hr="t" fillcolor="#a0a0a0" stroked="f"/>
+          <v:rect id="_x0000_i1027" style="width:0;height:1.5pt" o:hralign="center" o:hrstd="t" o:hr="t" fillcolor="#a0a0a0" stroked="f"/>
         </w:pict>
       </w:r>
     </w:p>
@@ -472,16 +469,7 @@
       <w:bookmarkStart w:id="13" w:name="_v7khmttb1e1f" w:colFirst="0" w:colLast="0"/>
       <w:bookmarkEnd w:id="13"/>
       <w:r>
-        <w:t xml:space="preserve">Task </w:t>
-      </w:r>
-      <w:r>
-        <w:t>2</w:t>
-      </w:r>
-      <w:r>
-        <w:t>:</w:t>
-      </w:r>
-      <w:r>
-        <w:t xml:space="preserve"> Prototype</w:t>
+        <w:t>Task 2: Prototype</w:t>
       </w:r>
       <w:r>
         <w:t xml:space="preserve"> of web document</w:t>
@@ -502,19 +490,7 @@
           <w:rPr>
             <w:rStyle w:val="Hyperlink"/>
           </w:rPr>
-          <w:t>https://mirfanbese25seecs.wixsite.com/happybirthd</w:t>
-        </w:r>
-        <w:r>
-          <w:rPr>
-            <w:rStyle w:val="Hyperlink"/>
-          </w:rPr>
-          <w:t>a</w:t>
-        </w:r>
-        <w:r>
-          <w:rPr>
-            <w:rStyle w:val="Hyperlink"/>
-          </w:rPr>
-          <w:t>y</w:t>
+          <w:t>https://mirfanbese25seecs.wixsite.com/happybirthday</w:t>
         </w:r>
       </w:hyperlink>
     </w:p>
@@ -526,7 +502,7 @@
     <w:p>
       <w:r>
         <w:pict w14:anchorId="1F586C89">
-          <v:rect id="_x0000_i1042" style="width:0;height:1.5pt" o:hralign="center" o:hrstd="t" o:hr="t" fillcolor="#a0a0a0" stroked="f"/>
+          <v:rect id="_x0000_i1028" style="width:468pt;height:1.5pt" o:hralign="center" o:hrstd="t" o:hr="t" fillcolor="#a0a0a0" stroked="f"/>
         </w:pict>
       </w:r>
     </w:p>
@@ -538,6 +514,41 @@
         <w:spacing w:before="240" w:after="40"/>
         <w:ind w:left="720" w:hanging="360"/>
       </w:pPr>
+      <w:r>
+        <w:t xml:space="preserve">Task </w:t>
+      </w:r>
+      <w:r>
+        <w:t xml:space="preserve">3: </w:t>
+      </w:r>
+      <w:r>
+        <w:t>Build Your Webpage Prototype</w:t>
+      </w:r>
+    </w:p>
+    <w:p/>
+    <w:p>
+      <w:r>
+        <w:pict w14:anchorId="63202FB6">
+          <v:rect id="_x0000_i1030" style="width:468pt;height:1.5pt" o:hralign="center" o:hrstd="t" o:hr="t" fillcolor="#a0a0a0" stroked="f"/>
+        </w:pict>
+      </w:r>
+    </w:p>
+    <w:p>
+      <w:pPr>
+        <w:pStyle w:val="Heading2"/>
+        <w:keepNext w:val="0"/>
+        <w:keepLines w:val="0"/>
+        <w:spacing w:before="240" w:after="40"/>
+        <w:ind w:left="720" w:hanging="360"/>
+      </w:pPr>
+      <w:r>
+        <w:t xml:space="preserve">Task 4: Upload and </w:t>
+      </w:r>
+      <w:r>
+        <w:t xml:space="preserve">Publish </w:t>
+      </w:r>
+      <w:r>
+        <w:t>on GitHub</w:t>
+      </w:r>
     </w:p>
     <w:p>
       <w:pPr>
@@ -564,7 +575,7 @@
 </file>
 
 <file path=word/endnotes.xml><?xml version="1.0" encoding="utf-8"?>
-<w:endnotes xmlns:wpc="http://schemas.microsoft.com/office/word/2010/wordprocessingCanvas" xmlns:cx="http://schemas.microsoft.com/office/drawing/2014/chartex" xmlns:cx1="http://schemas.microsoft.com/office/drawing/2015/9/8/chartex" xmlns:cx2="http://schemas.microsoft.com/office/drawing/2015/10/21/chartex" xmlns:cx3="http://schemas.microsoft.com/office/drawing/2016/5/9/chartex" xmlns:cx4="http://schemas.microsoft.com/office/drawing/2016/5/10/chartex" xmlns:cx5="http://schemas.microsoft.com/office/drawing/2016/5/11/chartex" xmlns:cx6="http://schemas.microsoft.com/office/drawing/2016/5/12/chartex" xmlns:cx7="http://schemas.microsoft.com/office/drawing/2016/5/13/chartex" xmlns:cx8="http://schemas.microsoft.com/office/drawing/2016/5/14/chartex" xmlns:mc="http://schemas.openxmlformats.org/markup-compatibility/2006" xmlns:aink="http://schemas.microsoft.com/office/drawing/2016/ink" xmlns:am3d="http://schemas.microsoft.com/office/drawing/2017/model3d" xmlns:o="urn:schemas-microsoft-com:office:office" xmlns:r="http://schemas.openxmlformats.org/officeDocument/2006/relationships" xmlns:m="http://schemas.openxmlformats.org/officeDocument/2006/math" xmlns:v="urn:schemas-microsoft-com:vml" xmlns:wp14="http://schemas.microsoft.com/office/word/2010/wordprocessingDrawing" xmlns:wp="http://schemas.openxmlformats.org/drawingml/2006/wordprocessingDrawing" xmlns:w10="urn:schemas-microsoft-com:office:word" xmlns:w="http://schemas.openxmlformats.org/wordprocessingml/2006/main" xmlns:w14="http://schemas.microsoft.com/office/word/2010/wordml" xmlns:w15="http://schemas.microsoft.com/office/word/2012/wordml" xmlns:w16cex="http://schemas.microsoft.com/office/word/2018/wordml/cex" xmlns:w16cid="http://schemas.microsoft.com/office/word/2016/wordml/cid" xmlns:w16="http://schemas.microsoft.com/office/word/2018/wordml" xmlns:w16sdtdh="http://schemas.microsoft.com/office/word/2020/wordml/sdtdatahash" xmlns:w16se="http://schemas.microsoft.com/office/word/2015/wordml/symex" xmlns:wpg="http://schemas.microsoft.com/office/word/2010/wordprocessingGroup" xmlns:wpi="http://schemas.microsoft.com/office/word/2010/wordprocessingInk" xmlns:wne="http://schemas.microsoft.com/office/word/2006/wordml" xmlns:wps="http://schemas.microsoft.com/office/word/2010/wordprocessingShape" mc:Ignorable="w14 w15 w16se w16cid w16 w16cex w16sdtdh wp14">
+<w:endnotes xmlns:wpc="http://schemas.microsoft.com/office/word/2010/wordprocessingCanvas" xmlns:cx="http://schemas.microsoft.com/office/drawing/2014/chartex" xmlns:cx1="http://schemas.microsoft.com/office/drawing/2015/9/8/chartex" xmlns:cx2="http://schemas.microsoft.com/office/drawing/2015/10/21/chartex" xmlns:cx3="http://schemas.microsoft.com/office/drawing/2016/5/9/chartex" xmlns:cx4="http://schemas.microsoft.com/office/drawing/2016/5/10/chartex" xmlns:cx5="http://schemas.microsoft.com/office/drawing/2016/5/11/chartex" xmlns:cx6="http://schemas.microsoft.com/office/drawing/2016/5/12/chartex" xmlns:cx7="http://schemas.microsoft.com/office/drawing/2016/5/13/chartex" xmlns:cx8="http://schemas.microsoft.com/office/drawing/2016/5/14/chartex" xmlns:mc="http://schemas.openxmlformats.org/markup-compatibility/2006" xmlns:aink="http://schemas.microsoft.com/office/drawing/2016/ink" xmlns:am3d="http://schemas.microsoft.com/office/drawing/2017/model3d" xmlns:o="urn:schemas-microsoft-com:office:office" xmlns:oel="http://schemas.microsoft.com/office/2019/extlst" xmlns:r="http://schemas.openxmlformats.org/officeDocument/2006/relationships" xmlns:m="http://schemas.openxmlformats.org/officeDocument/2006/math" xmlns:v="urn:schemas-microsoft-com:vml" xmlns:wp14="http://schemas.microsoft.com/office/word/2010/wordprocessingDrawing" xmlns:wp="http://schemas.openxmlformats.org/drawingml/2006/wordprocessingDrawing" xmlns:w10="urn:schemas-microsoft-com:office:word" xmlns:w="http://schemas.openxmlformats.org/wordprocessingml/2006/main" xmlns:w14="http://schemas.microsoft.com/office/word/2010/wordml" xmlns:w15="http://schemas.microsoft.com/office/word/2012/wordml" xmlns:w16cex="http://schemas.microsoft.com/office/word/2018/wordml/cex" xmlns:w16cid="http://schemas.microsoft.com/office/word/2016/wordml/cid" xmlns:w16="http://schemas.microsoft.com/office/word/2018/wordml" xmlns:w16sdtdh="http://schemas.microsoft.com/office/word/2020/wordml/sdtdatahash" xmlns:w16se="http://schemas.microsoft.com/office/word/2015/wordml/symex" xmlns:wpg="http://schemas.microsoft.com/office/word/2010/wordprocessingGroup" xmlns:wpi="http://schemas.microsoft.com/office/word/2010/wordprocessingInk" xmlns:wne="http://schemas.microsoft.com/office/word/2006/wordml" xmlns:wps="http://schemas.microsoft.com/office/word/2010/wordprocessingShape" mc:Ignorable="w14 w15 w16se w16cid w16 w16cex w16sdtdh wp14">
   <w:endnote w:type="separator" w:id="-1">
     <w:p>
       <w:pPr>
@@ -589,7 +600,7 @@
 </file>
 
 <file path=word/footer1.xml><?xml version="1.0" encoding="utf-8"?>
-<w:ftr xmlns:wpc="http://schemas.microsoft.com/office/word/2010/wordprocessingCanvas" xmlns:cx="http://schemas.microsoft.com/office/drawing/2014/chartex" xmlns:cx1="http://schemas.microsoft.com/office/drawing/2015/9/8/chartex" xmlns:cx2="http://schemas.microsoft.com/office/drawing/2015/10/21/chartex" xmlns:cx3="http://schemas.microsoft.com/office/drawing/2016/5/9/chartex" xmlns:cx4="http://schemas.microsoft.com/office/drawing/2016/5/10/chartex" xmlns:cx5="http://schemas.microsoft.com/office/drawing/2016/5/11/chartex" xmlns:cx6="http://schemas.microsoft.com/office/drawing/2016/5/12/chartex" xmlns:cx7="http://schemas.microsoft.com/office/drawing/2016/5/13/chartex" xmlns:cx8="http://schemas.microsoft.com/office/drawing/2016/5/14/chartex" xmlns:mc="http://schemas.openxmlformats.org/markup-compatibility/2006" xmlns:aink="http://schemas.microsoft.com/office/drawing/2016/ink" xmlns:am3d="http://schemas.microsoft.com/office/drawing/2017/model3d" xmlns:o="urn:schemas-microsoft-com:office:office" xmlns:r="http://schemas.openxmlformats.org/officeDocument/2006/relationships" xmlns:m="http://schemas.openxmlformats.org/officeDocument/2006/math" xmlns:v="urn:schemas-microsoft-com:vml" xmlns:wp14="http://schemas.microsoft.com/office/word/2010/wordprocessingDrawing" xmlns:wp="http://schemas.openxmlformats.org/drawingml/2006/wordprocessingDrawing" xmlns:w10="urn:schemas-microsoft-com:office:word" xmlns:w="http://schemas.openxmlformats.org/wordprocessingml/2006/main" xmlns:w14="http://schemas.microsoft.com/office/word/2010/wordml" xmlns:w15="http://schemas.microsoft.com/office/word/2012/wordml" xmlns:w16cex="http://schemas.microsoft.com/office/word/2018/wordml/cex" xmlns:w16cid="http://schemas.microsoft.com/office/word/2016/wordml/cid" xmlns:w16="http://schemas.microsoft.com/office/word/2018/wordml" xmlns:w16sdtdh="http://schemas.microsoft.com/office/word/2020/wordml/sdtdatahash" xmlns:w16se="http://schemas.microsoft.com/office/word/2015/wordml/symex" xmlns:wpg="http://schemas.microsoft.com/office/word/2010/wordprocessingGroup" xmlns:wpi="http://schemas.microsoft.com/office/word/2010/wordprocessingInk" xmlns:wne="http://schemas.microsoft.com/office/word/2006/wordml" xmlns:wps="http://schemas.microsoft.com/office/word/2010/wordprocessingShape" mc:Ignorable="w14 w15 w16se w16cid w16 w16cex w16sdtdh wp14">
+<w:ftr xmlns:wpc="http://schemas.microsoft.com/office/word/2010/wordprocessingCanvas" xmlns:cx="http://schemas.microsoft.com/office/drawing/2014/chartex" xmlns:cx1="http://schemas.microsoft.com/office/drawing/2015/9/8/chartex" xmlns:cx2="http://schemas.microsoft.com/office/drawing/2015/10/21/chartex" xmlns:cx3="http://schemas.microsoft.com/office/drawing/2016/5/9/chartex" xmlns:cx4="http://schemas.microsoft.com/office/drawing/2016/5/10/chartex" xmlns:cx5="http://schemas.microsoft.com/office/drawing/2016/5/11/chartex" xmlns:cx6="http://schemas.microsoft.com/office/drawing/2016/5/12/chartex" xmlns:cx7="http://schemas.microsoft.com/office/drawing/2016/5/13/chartex" xmlns:cx8="http://schemas.microsoft.com/office/drawing/2016/5/14/chartex" xmlns:mc="http://schemas.openxmlformats.org/markup-compatibility/2006" xmlns:aink="http://schemas.microsoft.com/office/drawing/2016/ink" xmlns:am3d="http://schemas.microsoft.com/office/drawing/2017/model3d" xmlns:o="urn:schemas-microsoft-com:office:office" xmlns:oel="http://schemas.microsoft.com/office/2019/extlst" xmlns:r="http://schemas.openxmlformats.org/officeDocument/2006/relationships" xmlns:m="http://schemas.openxmlformats.org/officeDocument/2006/math" xmlns:v="urn:schemas-microsoft-com:vml" xmlns:wp14="http://schemas.microsoft.com/office/word/2010/wordprocessingDrawing" xmlns:wp="http://schemas.openxmlformats.org/drawingml/2006/wordprocessingDrawing" xmlns:w10="urn:schemas-microsoft-com:office:word" xmlns:w="http://schemas.openxmlformats.org/wordprocessingml/2006/main" xmlns:w14="http://schemas.microsoft.com/office/word/2010/wordml" xmlns:w15="http://schemas.microsoft.com/office/word/2012/wordml" xmlns:w16cex="http://schemas.microsoft.com/office/word/2018/wordml/cex" xmlns:w16cid="http://schemas.microsoft.com/office/word/2016/wordml/cid" xmlns:w16="http://schemas.microsoft.com/office/word/2018/wordml" xmlns:w16sdtdh="http://schemas.microsoft.com/office/word/2020/wordml/sdtdatahash" xmlns:w16se="http://schemas.microsoft.com/office/word/2015/wordml/symex" xmlns:wpg="http://schemas.microsoft.com/office/word/2010/wordprocessingGroup" xmlns:wpi="http://schemas.microsoft.com/office/word/2010/wordprocessingInk" xmlns:wne="http://schemas.microsoft.com/office/word/2006/wordml" xmlns:wps="http://schemas.microsoft.com/office/word/2010/wordprocessingShape" mc:Ignorable="w14 w15 w16se w16cid w16 w16cex w16sdtdh wp14">
   <w:p>
     <w:pPr>
       <w:jc w:val="right"/>
@@ -617,7 +628,7 @@
 </file>
 
 <file path=word/footnotes.xml><?xml version="1.0" encoding="utf-8"?>
-<w:footnotes xmlns:wpc="http://schemas.microsoft.com/office/word/2010/wordprocessingCanvas" xmlns:cx="http://schemas.microsoft.com/office/drawing/2014/chartex" xmlns:cx1="http://schemas.microsoft.com/office/drawing/2015/9/8/chartex" xmlns:cx2="http://schemas.microsoft.com/office/drawing/2015/10/21/chartex" xmlns:cx3="http://schemas.microsoft.com/office/drawing/2016/5/9/chartex" xmlns:cx4="http://schemas.microsoft.com/office/drawing/2016/5/10/chartex" xmlns:cx5="http://schemas.microsoft.com/office/drawing/2016/5/11/chartex" xmlns:cx6="http://schemas.microsoft.com/office/drawing/2016/5/12/chartex" xmlns:cx7="http://schemas.microsoft.com/office/drawing/2016/5/13/chartex" xmlns:cx8="http://schemas.microsoft.com/office/drawing/2016/5/14/chartex" xmlns:mc="http://schemas.openxmlformats.org/markup-compatibility/2006" xmlns:aink="http://schemas.microsoft.com/office/drawing/2016/ink" xmlns:am3d="http://schemas.microsoft.com/office/drawing/2017/model3d" xmlns:o="urn:schemas-microsoft-com:office:office" xmlns:r="http://schemas.openxmlformats.org/officeDocument/2006/relationships" xmlns:m="http://schemas.openxmlformats.org/officeDocument/2006/math" xmlns:v="urn:schemas-microsoft-com:vml" xmlns:wp14="http://schemas.microsoft.com/office/word/2010/wordprocessingDrawing" xmlns:wp="http://schemas.openxmlformats.org/drawingml/2006/wordprocessingDrawing" xmlns:w10="urn:schemas-microsoft-com:office:word" xmlns:w="http://schemas.openxmlformats.org/wordprocessingml/2006/main" xmlns:w14="http://schemas.microsoft.com/office/word/2010/wordml" xmlns:w15="http://schemas.microsoft.com/office/word/2012/wordml" xmlns:w16cex="http://schemas.microsoft.com/office/word/2018/wordml/cex" xmlns:w16cid="http://schemas.microsoft.com/office/word/2016/wordml/cid" xmlns:w16="http://schemas.microsoft.com/office/word/2018/wordml" xmlns:w16sdtdh="http://schemas.microsoft.com/office/word/2020/wordml/sdtdatahash" xmlns:w16se="http://schemas.microsoft.com/office/word/2015/wordml/symex" xmlns:wpg="http://schemas.microsoft.com/office/word/2010/wordprocessingGroup" xmlns:wpi="http://schemas.microsoft.com/office/word/2010/wordprocessingInk" xmlns:wne="http://schemas.microsoft.com/office/word/2006/wordml" xmlns:wps="http://schemas.microsoft.com/office/word/2010/wordprocessingShape" mc:Ignorable="w14 w15 w16se w16cid w16 w16cex w16sdtdh wp14">
+<w:footnotes xmlns:wpc="http://schemas.microsoft.com/office/word/2010/wordprocessingCanvas" xmlns:cx="http://schemas.microsoft.com/office/drawing/2014/chartex" xmlns:cx1="http://schemas.microsoft.com/office/drawing/2015/9/8/chartex" xmlns:cx2="http://schemas.microsoft.com/office/drawing/2015/10/21/chartex" xmlns:cx3="http://schemas.microsoft.com/office/drawing/2016/5/9/chartex" xmlns:cx4="http://schemas.microsoft.com/office/drawing/2016/5/10/chartex" xmlns:cx5="http://schemas.microsoft.com/office/drawing/2016/5/11/chartex" xmlns:cx6="http://schemas.microsoft.com/office/drawing/2016/5/12/chartex" xmlns:cx7="http://schemas.microsoft.com/office/drawing/2016/5/13/chartex" xmlns:cx8="http://schemas.microsoft.com/office/drawing/2016/5/14/chartex" xmlns:mc="http://schemas.openxmlformats.org/markup-compatibility/2006" xmlns:aink="http://schemas.microsoft.com/office/drawing/2016/ink" xmlns:am3d="http://schemas.microsoft.com/office/drawing/2017/model3d" xmlns:o="urn:schemas-microsoft-com:office:office" xmlns:oel="http://schemas.microsoft.com/office/2019/extlst" xmlns:r="http://schemas.openxmlformats.org/officeDocument/2006/relationships" xmlns:m="http://schemas.openxmlformats.org/officeDocument/2006/math" xmlns:v="urn:schemas-microsoft-com:vml" xmlns:wp14="http://schemas.microsoft.com/office/word/2010/wordprocessingDrawing" xmlns:wp="http://schemas.openxmlformats.org/drawingml/2006/wordprocessingDrawing" xmlns:w10="urn:schemas-microsoft-com:office:word" xmlns:w="http://schemas.openxmlformats.org/wordprocessingml/2006/main" xmlns:w14="http://schemas.microsoft.com/office/word/2010/wordml" xmlns:w15="http://schemas.microsoft.com/office/word/2012/wordml" xmlns:w16cex="http://schemas.microsoft.com/office/word/2018/wordml/cex" xmlns:w16cid="http://schemas.microsoft.com/office/word/2016/wordml/cid" xmlns:w16="http://schemas.microsoft.com/office/word/2018/wordml" xmlns:w16sdtdh="http://schemas.microsoft.com/office/word/2020/wordml/sdtdatahash" xmlns:w16se="http://schemas.microsoft.com/office/word/2015/wordml/symex" xmlns:wpg="http://schemas.microsoft.com/office/word/2010/wordprocessingGroup" xmlns:wpi="http://schemas.microsoft.com/office/word/2010/wordprocessingInk" xmlns:wne="http://schemas.microsoft.com/office/word/2006/wordml" xmlns:wps="http://schemas.microsoft.com/office/word/2010/wordprocessingShape" mc:Ignorable="w14 w15 w16se w16cid w16 w16cex w16sdtdh wp14">
   <w:footnote w:type="separator" w:id="-1">
     <w:p>
       <w:pPr>
@@ -642,7 +653,7 @@
 </file>
 
 <file path=word/header1.xml><?xml version="1.0" encoding="utf-8"?>
-<w:hdr xmlns:wpc="http://schemas.microsoft.com/office/word/2010/wordprocessingCanvas" xmlns:cx="http://schemas.microsoft.com/office/drawing/2014/chartex" xmlns:cx1="http://schemas.microsoft.com/office/drawing/2015/9/8/chartex" xmlns:cx2="http://schemas.microsoft.com/office/drawing/2015/10/21/chartex" xmlns:cx3="http://schemas.microsoft.com/office/drawing/2016/5/9/chartex" xmlns:cx4="http://schemas.microsoft.com/office/drawing/2016/5/10/chartex" xmlns:cx5="http://schemas.microsoft.com/office/drawing/2016/5/11/chartex" xmlns:cx6="http://schemas.microsoft.com/office/drawing/2016/5/12/chartex" xmlns:cx7="http://schemas.microsoft.com/office/drawing/2016/5/13/chartex" xmlns:cx8="http://schemas.microsoft.com/office/drawing/2016/5/14/chartex" xmlns:mc="http://schemas.openxmlformats.org/markup-compatibility/2006" xmlns:aink="http://schemas.microsoft.com/office/drawing/2016/ink" xmlns:am3d="http://schemas.microsoft.com/office/drawing/2017/model3d" xmlns:o="urn:schemas-microsoft-com:office:office" xmlns:r="http://schemas.openxmlformats.org/officeDocument/2006/relationships" xmlns:m="http://schemas.openxmlformats.org/officeDocument/2006/math" xmlns:v="urn:schemas-microsoft-com:vml" xmlns:wp14="http://schemas.microsoft.com/office/word/2010/wordprocessingDrawing" xmlns:wp="http://schemas.openxmlformats.org/drawingml/2006/wordprocessingDrawing" xmlns:w10="urn:schemas-microsoft-com:office:word" xmlns:w="http://schemas.openxmlformats.org/wordprocessingml/2006/main" xmlns:w14="http://schemas.microsoft.com/office/word/2010/wordml" xmlns:w15="http://schemas.microsoft.com/office/word/2012/wordml" xmlns:w16cex="http://schemas.microsoft.com/office/word/2018/wordml/cex" xmlns:w16cid="http://schemas.microsoft.com/office/word/2016/wordml/cid" xmlns:w16="http://schemas.microsoft.com/office/word/2018/wordml" xmlns:w16sdtdh="http://schemas.microsoft.com/office/word/2020/wordml/sdtdatahash" xmlns:w16se="http://schemas.microsoft.com/office/word/2015/wordml/symex" xmlns:wpg="http://schemas.microsoft.com/office/word/2010/wordprocessingGroup" xmlns:wpi="http://schemas.microsoft.com/office/word/2010/wordprocessingInk" xmlns:wne="http://schemas.microsoft.com/office/word/2006/wordml" xmlns:wps="http://schemas.microsoft.com/office/word/2010/wordprocessingShape" mc:Ignorable="w14 w15 w16se w16cid w16 w16cex w16sdtdh wp14">
+<w:hdr xmlns:wpc="http://schemas.microsoft.com/office/word/2010/wordprocessingCanvas" xmlns:cx="http://schemas.microsoft.com/office/drawing/2014/chartex" xmlns:cx1="http://schemas.microsoft.com/office/drawing/2015/9/8/chartex" xmlns:cx2="http://schemas.microsoft.com/office/drawing/2015/10/21/chartex" xmlns:cx3="http://schemas.microsoft.com/office/drawing/2016/5/9/chartex" xmlns:cx4="http://schemas.microsoft.com/office/drawing/2016/5/10/chartex" xmlns:cx5="http://schemas.microsoft.com/office/drawing/2016/5/11/chartex" xmlns:cx6="http://schemas.microsoft.com/office/drawing/2016/5/12/chartex" xmlns:cx7="http://schemas.microsoft.com/office/drawing/2016/5/13/chartex" xmlns:cx8="http://schemas.microsoft.com/office/drawing/2016/5/14/chartex" xmlns:mc="http://schemas.openxmlformats.org/markup-compatibility/2006" xmlns:aink="http://schemas.microsoft.com/office/drawing/2016/ink" xmlns:am3d="http://schemas.microsoft.com/office/drawing/2017/model3d" xmlns:o="urn:schemas-microsoft-com:office:office" xmlns:oel="http://schemas.microsoft.com/office/2019/extlst" xmlns:r="http://schemas.openxmlformats.org/officeDocument/2006/relationships" xmlns:m="http://schemas.openxmlformats.org/officeDocument/2006/math" xmlns:v="urn:schemas-microsoft-com:vml" xmlns:wp14="http://schemas.microsoft.com/office/word/2010/wordprocessingDrawing" xmlns:wp="http://schemas.openxmlformats.org/drawingml/2006/wordprocessingDrawing" xmlns:w10="urn:schemas-microsoft-com:office:word" xmlns:w="http://schemas.openxmlformats.org/wordprocessingml/2006/main" xmlns:w14="http://schemas.microsoft.com/office/word/2010/wordml" xmlns:w15="http://schemas.microsoft.com/office/word/2012/wordml" xmlns:w16cex="http://schemas.microsoft.com/office/word/2018/wordml/cex" xmlns:w16cid="http://schemas.microsoft.com/office/word/2016/wordml/cid" xmlns:w16="http://schemas.microsoft.com/office/word/2018/wordml" xmlns:w16sdtdh="http://schemas.microsoft.com/office/word/2020/wordml/sdtdatahash" xmlns:w16se="http://schemas.microsoft.com/office/word/2015/wordml/symex" xmlns:wpg="http://schemas.microsoft.com/office/word/2010/wordprocessingGroup" xmlns:wpi="http://schemas.microsoft.com/office/word/2010/wordprocessingInk" xmlns:wne="http://schemas.microsoft.com/office/word/2006/wordml" xmlns:wps="http://schemas.microsoft.com/office/word/2010/wordprocessingShape" mc:Ignorable="w14 w15 w16se w16cid w16 w16cex w16sdtdh wp14">
   <w:p>
     <w:r>
       <w:rPr>
@@ -689,10 +700,10 @@
 </file>
 
 <file path=word/numbering.xml><?xml version="1.0" encoding="utf-8"?>
-<w:numbering xmlns:wpc="http://schemas.microsoft.com/office/word/2010/wordprocessingCanvas" xmlns:cx="http://schemas.microsoft.com/office/drawing/2014/chartex" xmlns:cx1="http://schemas.microsoft.com/office/drawing/2015/9/8/chartex" xmlns:cx2="http://schemas.microsoft.com/office/drawing/2015/10/21/chartex" xmlns:cx3="http://schemas.microsoft.com/office/drawing/2016/5/9/chartex" xmlns:cx4="http://schemas.microsoft.com/office/drawing/2016/5/10/chartex" xmlns:cx5="http://schemas.microsoft.com/office/drawing/2016/5/11/chartex" xmlns:cx6="http://schemas.microsoft.com/office/drawing/2016/5/12/chartex" xmlns:cx7="http://schemas.microsoft.com/office/drawing/2016/5/13/chartex" xmlns:cx8="http://schemas.microsoft.com/office/drawing/2016/5/14/chartex" xmlns:mc="http://schemas.openxmlformats.org/markup-compatibility/2006" xmlns:aink="http://schemas.microsoft.com/office/drawing/2016/ink" xmlns:am3d="http://schemas.microsoft.com/office/drawing/2017/model3d" xmlns:o="urn:schemas-microsoft-com:office:office" xmlns:r="http://schemas.openxmlformats.org/officeDocument/2006/relationships" xmlns:m="http://schemas.openxmlformats.org/officeDocument/2006/math" xmlns:v="urn:schemas-microsoft-com:vml" xmlns:wp14="http://schemas.microsoft.com/office/word/2010/wordprocessingDrawing" xmlns:wp="http://schemas.openxmlformats.org/drawingml/2006/wordprocessingDrawing" xmlns:w10="urn:schemas-microsoft-com:office:word" xmlns:w="http://schemas.openxmlformats.org/wordprocessingml/2006/main" xmlns:w14="http://schemas.microsoft.com/office/word/2010/wordml" xmlns:w15="http://schemas.microsoft.com/office/word/2012/wordml" xmlns:w16cex="http://schemas.microsoft.com/office/word/2018/wordml/cex" xmlns:w16cid="http://schemas.microsoft.com/office/word/2016/wordml/cid" xmlns:w16="http://schemas.microsoft.com/office/word/2018/wordml" xmlns:w16sdtdh="http://schemas.microsoft.com/office/word/2020/wordml/sdtdatahash" xmlns:w16se="http://schemas.microsoft.com/office/word/2015/wordml/symex" xmlns:wpg="http://schemas.microsoft.com/office/word/2010/wordprocessingGroup" xmlns:wpi="http://schemas.microsoft.com/office/word/2010/wordprocessingInk" xmlns:wne="http://schemas.microsoft.com/office/word/2006/wordml" xmlns:wps="http://schemas.microsoft.com/office/word/2010/wordprocessingShape" mc:Ignorable="w14 w15 w16se w16cid w16 w16cex w16sdtdh wp14">
+<w:numbering xmlns:wpc="http://schemas.microsoft.com/office/word/2010/wordprocessingCanvas" xmlns:cx="http://schemas.microsoft.com/office/drawing/2014/chartex" xmlns:cx1="http://schemas.microsoft.com/office/drawing/2015/9/8/chartex" xmlns:cx2="http://schemas.microsoft.com/office/drawing/2015/10/21/chartex" xmlns:cx3="http://schemas.microsoft.com/office/drawing/2016/5/9/chartex" xmlns:cx4="http://schemas.microsoft.com/office/drawing/2016/5/10/chartex" xmlns:cx5="http://schemas.microsoft.com/office/drawing/2016/5/11/chartex" xmlns:cx6="http://schemas.microsoft.com/office/drawing/2016/5/12/chartex" xmlns:cx7="http://schemas.microsoft.com/office/drawing/2016/5/13/chartex" xmlns:cx8="http://schemas.microsoft.com/office/drawing/2016/5/14/chartex" xmlns:mc="http://schemas.openxmlformats.org/markup-compatibility/2006" xmlns:aink="http://schemas.microsoft.com/office/drawing/2016/ink" xmlns:am3d="http://schemas.microsoft.com/office/drawing/2017/model3d" xmlns:o="urn:schemas-microsoft-com:office:office" xmlns:oel="http://schemas.microsoft.com/office/2019/extlst" xmlns:r="http://schemas.openxmlformats.org/officeDocument/2006/relationships" xmlns:m="http://schemas.openxmlformats.org/officeDocument/2006/math" xmlns:v="urn:schemas-microsoft-com:vml" xmlns:wp14="http://schemas.microsoft.com/office/word/2010/wordprocessingDrawing" xmlns:wp="http://schemas.openxmlformats.org/drawingml/2006/wordprocessingDrawing" xmlns:w10="urn:schemas-microsoft-com:office:word" xmlns:w="http://schemas.openxmlformats.org/wordprocessingml/2006/main" xmlns:w14="http://schemas.microsoft.com/office/word/2010/wordml" xmlns:w15="http://schemas.microsoft.com/office/word/2012/wordml" xmlns:w16cex="http://schemas.microsoft.com/office/word/2018/wordml/cex" xmlns:w16cid="http://schemas.microsoft.com/office/word/2016/wordml/cid" xmlns:w16="http://schemas.microsoft.com/office/word/2018/wordml" xmlns:w16sdtdh="http://schemas.microsoft.com/office/word/2020/wordml/sdtdatahash" xmlns:w16se="http://schemas.microsoft.com/office/word/2015/wordml/symex" xmlns:wpg="http://schemas.microsoft.com/office/word/2010/wordprocessingGroup" xmlns:wpi="http://schemas.microsoft.com/office/word/2010/wordprocessingInk" xmlns:wne="http://schemas.microsoft.com/office/word/2006/wordml" xmlns:wps="http://schemas.microsoft.com/office/word/2010/wordprocessingShape" mc:Ignorable="w14 w15 w16se w16cid w16 w16cex w16sdtdh wp14">
   <w:numPicBullet w:numPicBulletId="0">
     <w:pict>
-      <v:rect id="_x0000_i1041" style="width:0;height:1.5pt" o:hralign="center" o:bullet="t" o:hrstd="t" o:hr="t" fillcolor="#a0a0a0" stroked="f"/>
+      <v:rect id="_x0000_i1045" style="width:0;height:1.5pt" o:hralign="center" o:bullet="t" o:hrstd="t" o:hr="t" fillcolor="#a0a0a0" stroked="f"/>
     </w:pict>
   </w:numPicBullet>
   <w:abstractNum w:abstractNumId="0" w15:restartNumberingAfterBreak="0">
@@ -808,7 +819,7 @@
       </w:rPr>
     </w:lvl>
   </w:abstractNum>
-  <w:num w:numId="1">
+  <w:num w:numId="1" w16cid:durableId="856775527">
     <w:abstractNumId w:val="0"/>
   </w:num>
 </w:numbering>
@@ -1329,7 +1340,6 @@
   <w:style w:type="character" w:default="1" w:styleId="DefaultParagraphFont">
     <w:name w:val="Default Paragraph Font"/>
     <w:uiPriority w:val="1"/>
-    <w:semiHidden/>
     <w:unhideWhenUsed/>
   </w:style>
   <w:style w:type="table" w:default="1" w:styleId="TableNormal">

</xml_diff>

<commit_message>
added github link to doc file
</commit_message>
<xml_diff>
--- a/lab 5.docx
+++ b/lab 5.docx
@@ -402,13 +402,8 @@
         <w:t xml:space="preserve">Task 1: </w:t>
       </w:r>
       <w:r>
-        <w:t xml:space="preserve">Form Teams and Brainstorm an </w:t>
-      </w:r>
-      <w:proofErr w:type="gramStart"/>
-      <w:r>
-        <w:t>Idea</w:t>
-      </w:r>
-      <w:proofErr w:type="gramEnd"/>
+        <w:t>Form Teams and Brainstorm an Idea</w:t>
+      </w:r>
     </w:p>
     <w:p>
       <w:pPr>
@@ -435,17 +430,7 @@
     </w:p>
     <w:p>
       <w:pPr>
-        <w:spacing w:before="240" w:after="240"/>
-        <w:ind w:left="720"/>
-      </w:pPr>
-      <w:r>
-        <w:br/>
-      </w:r>
-    </w:p>
-    <w:p>
-      <w:pPr>
-        <w:spacing w:before="240" w:after="240"/>
-        <w:ind w:left="720"/>
+        <w:ind w:firstLine="360"/>
       </w:pPr>
     </w:p>
     <w:p>
@@ -515,10 +500,7 @@
         <w:ind w:left="720" w:hanging="360"/>
       </w:pPr>
       <w:r>
-        <w:t xml:space="preserve">Task </w:t>
-      </w:r>
-      <w:r>
-        <w:t xml:space="preserve">3: </w:t>
+        <w:t xml:space="preserve">Task 3: </w:t>
       </w:r>
       <w:r>
         <w:t>Build Your Webpage Prototype</w:t>
@@ -528,7 +510,7 @@
     <w:p>
       <w:r>
         <w:pict w14:anchorId="63202FB6">
-          <v:rect id="_x0000_i1030" style="width:468pt;height:1.5pt" o:hralign="center" o:hrstd="t" o:hr="t" fillcolor="#a0a0a0" stroked="f"/>
+          <v:rect id="_x0000_i1029" style="width:468pt;height:1.5pt" o:hralign="center" o:hrstd="t" o:hr="t" fillcolor="#a0a0a0" stroked="f"/>
         </w:pict>
       </w:r>
     </w:p>
@@ -555,6 +537,31 @@
         <w:spacing w:before="240" w:after="240"/>
         <w:ind w:left="720" w:hanging="360"/>
       </w:pPr>
+      <w:r>
+        <w:t xml:space="preserve">Link of the </w:t>
+      </w:r>
+      <w:proofErr w:type="spellStart"/>
+      <w:r>
+        <w:t>Github</w:t>
+      </w:r>
+      <w:proofErr w:type="spellEnd"/>
+      <w:r>
+        <w:t xml:space="preserve"> Repo:</w:t>
+      </w:r>
+    </w:p>
+    <w:p>
+      <w:pPr>
+        <w:spacing w:before="240" w:after="240"/>
+        <w:ind w:left="720" w:hanging="360"/>
+      </w:pPr>
+      <w:hyperlink r:id="rId9" w:history="1">
+        <w:r>
+          <w:rPr>
+            <w:rStyle w:val="Hyperlink"/>
+          </w:rPr>
+          <w:t>https://github.com/RaffayIrfan/WebDesign_Lab05_Group16</w:t>
+        </w:r>
+      </w:hyperlink>
     </w:p>
     <w:p/>
     <w:p>
@@ -563,8 +570,8 @@
       </w:pPr>
     </w:p>
     <w:sectPr>
-      <w:headerReference w:type="default" r:id="rId9"/>
-      <w:footerReference w:type="default" r:id="rId10"/>
+      <w:headerReference w:type="default" r:id="rId10"/>
+      <w:footerReference w:type="default" r:id="rId11"/>
       <w:pgSz w:w="12240" w:h="15840"/>
       <w:pgMar w:top="1440" w:right="1440" w:bottom="1440" w:left="1440" w:header="720" w:footer="720" w:gutter="0"/>
       <w:pgNumType w:start="1"/>
@@ -703,7 +710,7 @@
 <w:numbering xmlns:wpc="http://schemas.microsoft.com/office/word/2010/wordprocessingCanvas" xmlns:cx="http://schemas.microsoft.com/office/drawing/2014/chartex" xmlns:cx1="http://schemas.microsoft.com/office/drawing/2015/9/8/chartex" xmlns:cx2="http://schemas.microsoft.com/office/drawing/2015/10/21/chartex" xmlns:cx3="http://schemas.microsoft.com/office/drawing/2016/5/9/chartex" xmlns:cx4="http://schemas.microsoft.com/office/drawing/2016/5/10/chartex" xmlns:cx5="http://schemas.microsoft.com/office/drawing/2016/5/11/chartex" xmlns:cx6="http://schemas.microsoft.com/office/drawing/2016/5/12/chartex" xmlns:cx7="http://schemas.microsoft.com/office/drawing/2016/5/13/chartex" xmlns:cx8="http://schemas.microsoft.com/office/drawing/2016/5/14/chartex" xmlns:mc="http://schemas.openxmlformats.org/markup-compatibility/2006" xmlns:aink="http://schemas.microsoft.com/office/drawing/2016/ink" xmlns:am3d="http://schemas.microsoft.com/office/drawing/2017/model3d" xmlns:o="urn:schemas-microsoft-com:office:office" xmlns:oel="http://schemas.microsoft.com/office/2019/extlst" xmlns:r="http://schemas.openxmlformats.org/officeDocument/2006/relationships" xmlns:m="http://schemas.openxmlformats.org/officeDocument/2006/math" xmlns:v="urn:schemas-microsoft-com:vml" xmlns:wp14="http://schemas.microsoft.com/office/word/2010/wordprocessingDrawing" xmlns:wp="http://schemas.openxmlformats.org/drawingml/2006/wordprocessingDrawing" xmlns:w10="urn:schemas-microsoft-com:office:word" xmlns:w="http://schemas.openxmlformats.org/wordprocessingml/2006/main" xmlns:w14="http://schemas.microsoft.com/office/word/2010/wordml" xmlns:w15="http://schemas.microsoft.com/office/word/2012/wordml" xmlns:w16cex="http://schemas.microsoft.com/office/word/2018/wordml/cex" xmlns:w16cid="http://schemas.microsoft.com/office/word/2016/wordml/cid" xmlns:w16="http://schemas.microsoft.com/office/word/2018/wordml" xmlns:w16sdtdh="http://schemas.microsoft.com/office/word/2020/wordml/sdtdatahash" xmlns:w16se="http://schemas.microsoft.com/office/word/2015/wordml/symex" xmlns:wpg="http://schemas.microsoft.com/office/word/2010/wordprocessingGroup" xmlns:wpi="http://schemas.microsoft.com/office/word/2010/wordprocessingInk" xmlns:wne="http://schemas.microsoft.com/office/word/2006/wordml" xmlns:wps="http://schemas.microsoft.com/office/word/2010/wordprocessingShape" mc:Ignorable="w14 w15 w16se w16cid w16 w16cex w16sdtdh wp14">
   <w:numPicBullet w:numPicBulletId="0">
     <w:pict>
-      <v:rect id="_x0000_i1045" style="width:0;height:1.5pt" o:hralign="center" o:bullet="t" o:hrstd="t" o:hr="t" fillcolor="#a0a0a0" stroked="f"/>
+      <v:rect id="_x0000_i1031" style="width:0;height:1.5pt" o:hralign="center" o:bullet="t" o:hrstd="t" o:hr="t" fillcolor="#a0a0a0" stroked="f"/>
     </w:pict>
   </w:numPicBullet>
   <w:abstractNum w:abstractNumId="0" w15:restartNumberingAfterBreak="0">
@@ -1340,6 +1347,7 @@
   <w:style w:type="character" w:default="1" w:styleId="DefaultParagraphFont">
     <w:name w:val="Default Paragraph Font"/>
     <w:uiPriority w:val="1"/>
+    <w:semiHidden/>
     <w:unhideWhenUsed/>
   </w:style>
   <w:style w:type="table" w:default="1" w:styleId="TableNormal">

</xml_diff>

<commit_message>
some doc file addings
</commit_message>
<xml_diff>
--- a/lab 5.docx
+++ b/lab 5.docx
@@ -326,16 +326,8 @@
         <w:rPr>
           <w:b/>
         </w:rPr>
-        <w:t xml:space="preserve"> </w:t>
-      </w:r>
-      <w:proofErr w:type="spellStart"/>
-      <w:r>
-        <w:rPr>
-          <w:b/>
-        </w:rPr>
-        <w:t>irfan</w:t>
-      </w:r>
-      <w:proofErr w:type="spellEnd"/>
+        <w:t xml:space="preserve"> irfan</w:t>
+      </w:r>
       <w:r>
         <w:rPr>
           <w:b/>
@@ -402,14 +394,58 @@
         <w:t xml:space="preserve">Task 1: </w:t>
       </w:r>
       <w:r>
-        <w:t>Form Teams and Brainstorm an Idea</w:t>
-      </w:r>
+        <w:t xml:space="preserve">Form Teams and Brainstorm an </w:t>
+      </w:r>
+      <w:proofErr w:type="gramStart"/>
+      <w:r>
+        <w:t>Idea</w:t>
+      </w:r>
+      <w:proofErr w:type="gramEnd"/>
     </w:p>
     <w:p>
       <w:pPr>
         <w:ind w:firstLine="360"/>
       </w:pPr>
       <w:r>
+        <w:t>T</w:t>
+      </w:r>
+      <w:r>
+        <w:t>eam o</w:t>
+      </w:r>
+      <w:r>
+        <w:t>f</w:t>
+      </w:r>
+      <w:r>
+        <w:t xml:space="preserve"> two students</w:t>
+      </w:r>
+      <w:r>
+        <w:t xml:space="preserve">: Abdul </w:t>
+      </w:r>
+      <w:proofErr w:type="spellStart"/>
+      <w:r>
+        <w:t>Rafay</w:t>
+      </w:r>
+      <w:proofErr w:type="spellEnd"/>
+      <w:r>
+        <w:t xml:space="preserve"> and Muhammad </w:t>
+      </w:r>
+      <w:proofErr w:type="spellStart"/>
+      <w:r>
+        <w:t>Raffay</w:t>
+      </w:r>
+      <w:proofErr w:type="spellEnd"/>
+      <w:r>
+        <w:t xml:space="preserve"> irfan</w:t>
+      </w:r>
+    </w:p>
+    <w:p>
+      <w:pPr>
+        <w:ind w:firstLine="360"/>
+        <w:rPr>
+          <w:rFonts w:ascii="Segoe UI Emoji" w:hAnsi="Segoe UI Emoji" w:cs="Segoe UI Emoji"/>
+        </w:rPr>
+      </w:pPr>
+      <w:r>
         <w:t>Theme</w:t>
       </w:r>
       <w:r>
@@ -427,6 +463,104 @@
         </w:rPr>
         <w:t>🎂</w:t>
       </w:r>
+    </w:p>
+    <w:p>
+      <w:pPr>
+        <w:ind w:firstLine="360"/>
+        <w:rPr>
+          <w:rFonts w:ascii="Segoe UI Emoji" w:hAnsi="Segoe UI Emoji" w:cs="Segoe UI Emoji"/>
+        </w:rPr>
+      </w:pPr>
+      <w:r>
+        <w:rPr>
+          <w:rFonts w:ascii="Segoe UI Emoji" w:hAnsi="Segoe UI Emoji" w:cs="Segoe UI Emoji"/>
+        </w:rPr>
+        <w:t>The webpage is about congratulating and inviting any person who has a birthday today.</w:t>
+      </w:r>
+    </w:p>
+    <w:p>
+      <w:pPr>
+        <w:rPr>
+          <w:rFonts w:ascii="Segoe UI Emoji" w:hAnsi="Segoe UI Emoji" w:cs="Segoe UI Emoji"/>
+        </w:rPr>
+      </w:pPr>
+      <w:r>
+        <w:rPr>
+          <w:rFonts w:ascii="Segoe UI Emoji" w:hAnsi="Segoe UI Emoji" w:cs="Segoe UI Emoji"/>
+        </w:rPr>
+        <w:t>The webpage shows about myself and surprise that person with confetti and a video about happy birthday in a</w:t>
+      </w:r>
+      <w:r>
+        <w:rPr>
+          <w:rFonts w:ascii="Segoe UI Emoji" w:hAnsi="Segoe UI Emoji" w:cs="Segoe UI Emoji"/>
+        </w:rPr>
+        <w:t>n</w:t>
+      </w:r>
+      <w:r>
+        <w:rPr>
+          <w:rFonts w:ascii="Segoe UI Emoji" w:hAnsi="Segoe UI Emoji" w:cs="Segoe UI Emoji"/>
+        </w:rPr>
+        <w:t xml:space="preserve"> </w:t>
+      </w:r>
+      <w:r>
+        <w:rPr>
+          <w:rFonts w:ascii="Segoe UI Emoji" w:hAnsi="Segoe UI Emoji" w:cs="Segoe UI Emoji"/>
+        </w:rPr>
+        <w:t>Indian</w:t>
+      </w:r>
+      <w:r>
+        <w:rPr>
+          <w:rFonts w:ascii="Segoe UI Emoji" w:hAnsi="Segoe UI Emoji" w:cs="Segoe UI Emoji"/>
+        </w:rPr>
+        <w:t xml:space="preserve"> language which is quite hilarious. If the person wants to come to my </w:t>
+      </w:r>
+      <w:r>
+        <w:rPr>
+          <w:rFonts w:ascii="Segoe UI Emoji" w:hAnsi="Segoe UI Emoji" w:cs="Segoe UI Emoji"/>
+        </w:rPr>
+        <w:t>accommodation</w:t>
+      </w:r>
+      <w:r>
+        <w:rPr>
+          <w:rFonts w:ascii="Segoe UI Emoji" w:hAnsi="Segoe UI Emoji" w:cs="Segoe UI Emoji"/>
+        </w:rPr>
+        <w:t xml:space="preserve"> </w:t>
+      </w:r>
+      <w:r>
+        <w:rPr>
+          <w:rFonts w:ascii="Segoe UI Emoji" w:hAnsi="Segoe UI Emoji" w:cs="Segoe UI Emoji"/>
+        </w:rPr>
+        <w:t>for a sweet surprise, there is a</w:t>
+      </w:r>
+      <w:r>
+        <w:rPr>
+          <w:rFonts w:ascii="Segoe UI Emoji" w:hAnsi="Segoe UI Emoji" w:cs="Segoe UI Emoji"/>
+        </w:rPr>
+        <w:t>n</w:t>
+      </w:r>
+      <w:r>
+        <w:rPr>
+          <w:rFonts w:ascii="Segoe UI Emoji" w:hAnsi="Segoe UI Emoji" w:cs="Segoe UI Emoji"/>
+        </w:rPr>
+        <w:t xml:space="preserve"> about page too, so that he can find my address.</w:t>
+      </w:r>
+      <w:r>
+        <w:rPr>
+          <w:rFonts w:ascii="Segoe UI Emoji" w:hAnsi="Segoe UI Emoji" w:cs="Segoe UI Emoji"/>
+        </w:rPr>
+        <w:t xml:space="preserve"> </w:t>
+      </w:r>
+      <w:r>
+        <w:rPr>
+          <w:rFonts w:ascii="Segoe UI Emoji" w:hAnsi="Segoe UI Emoji" w:cs="Segoe UI Emoji"/>
+        </w:rPr>
+        <w:t>It is for a friend who is dearest to one who’s sending it.</w:t>
+      </w:r>
+    </w:p>
+    <w:p>
+      <w:pPr>
+        <w:ind w:firstLine="360"/>
+      </w:pPr>
     </w:p>
     <w:p>
       <w:pPr>
@@ -525,8 +659,13 @@
       <w:r>
         <w:t xml:space="preserve">Task 4: Upload and </w:t>
       </w:r>
-      <w:r>
-        <w:t xml:space="preserve">Publish </w:t>
+      <w:proofErr w:type="gramStart"/>
+      <w:r>
+        <w:t>Publish</w:t>
+      </w:r>
+      <w:proofErr w:type="gramEnd"/>
+      <w:r>
+        <w:t xml:space="preserve"> </w:t>
       </w:r>
       <w:r>
         <w:t>on GitHub</w:t>
@@ -710,7 +849,7 @@
 <w:numbering xmlns:wpc="http://schemas.microsoft.com/office/word/2010/wordprocessingCanvas" xmlns:cx="http://schemas.microsoft.com/office/drawing/2014/chartex" xmlns:cx1="http://schemas.microsoft.com/office/drawing/2015/9/8/chartex" xmlns:cx2="http://schemas.microsoft.com/office/drawing/2015/10/21/chartex" xmlns:cx3="http://schemas.microsoft.com/office/drawing/2016/5/9/chartex" xmlns:cx4="http://schemas.microsoft.com/office/drawing/2016/5/10/chartex" xmlns:cx5="http://schemas.microsoft.com/office/drawing/2016/5/11/chartex" xmlns:cx6="http://schemas.microsoft.com/office/drawing/2016/5/12/chartex" xmlns:cx7="http://schemas.microsoft.com/office/drawing/2016/5/13/chartex" xmlns:cx8="http://schemas.microsoft.com/office/drawing/2016/5/14/chartex" xmlns:mc="http://schemas.openxmlformats.org/markup-compatibility/2006" xmlns:aink="http://schemas.microsoft.com/office/drawing/2016/ink" xmlns:am3d="http://schemas.microsoft.com/office/drawing/2017/model3d" xmlns:o="urn:schemas-microsoft-com:office:office" xmlns:oel="http://schemas.microsoft.com/office/2019/extlst" xmlns:r="http://schemas.openxmlformats.org/officeDocument/2006/relationships" xmlns:m="http://schemas.openxmlformats.org/officeDocument/2006/math" xmlns:v="urn:schemas-microsoft-com:vml" xmlns:wp14="http://schemas.microsoft.com/office/word/2010/wordprocessingDrawing" xmlns:wp="http://schemas.openxmlformats.org/drawingml/2006/wordprocessingDrawing" xmlns:w10="urn:schemas-microsoft-com:office:word" xmlns:w="http://schemas.openxmlformats.org/wordprocessingml/2006/main" xmlns:w14="http://schemas.microsoft.com/office/word/2010/wordml" xmlns:w15="http://schemas.microsoft.com/office/word/2012/wordml" xmlns:w16cex="http://schemas.microsoft.com/office/word/2018/wordml/cex" xmlns:w16cid="http://schemas.microsoft.com/office/word/2016/wordml/cid" xmlns:w16="http://schemas.microsoft.com/office/word/2018/wordml" xmlns:w16sdtdh="http://schemas.microsoft.com/office/word/2020/wordml/sdtdatahash" xmlns:w16se="http://schemas.microsoft.com/office/word/2015/wordml/symex" xmlns:wpg="http://schemas.microsoft.com/office/word/2010/wordprocessingGroup" xmlns:wpi="http://schemas.microsoft.com/office/word/2010/wordprocessingInk" xmlns:wne="http://schemas.microsoft.com/office/word/2006/wordml" xmlns:wps="http://schemas.microsoft.com/office/word/2010/wordprocessingShape" mc:Ignorable="w14 w15 w16se w16cid w16 w16cex w16sdtdh wp14">
   <w:numPicBullet w:numPicBulletId="0">
     <w:pict>
-      <v:rect id="_x0000_i1031" style="width:0;height:1.5pt" o:hralign="center" o:bullet="t" o:hrstd="t" o:hr="t" fillcolor="#a0a0a0" stroked="f"/>
+      <v:rect id="_x0000_i1036" style="width:0;height:1.5pt" o:hralign="center" o:bullet="t" o:hrstd="t" o:hr="t" fillcolor="#a0a0a0" stroked="f"/>
     </w:pict>
   </w:numPicBullet>
   <w:abstractNum w:abstractNumId="0" w15:restartNumberingAfterBreak="0">
@@ -1347,7 +1486,6 @@
   <w:style w:type="character" w:default="1" w:styleId="DefaultParagraphFont">
     <w:name w:val="Default Paragraph Font"/>
     <w:uiPriority w:val="1"/>
-    <w:semiHidden/>
     <w:unhideWhenUsed/>
   </w:style>
   <w:style w:type="table" w:default="1" w:styleId="TableNormal">

</xml_diff>